<commit_message>
update revisi 5 penjamu
</commit_message>
<xml_diff>
--- a/uploads/template_laporan_led.docx
+++ b/uploads/template_laporan_led.docx
@@ -1913,6 +1913,57 @@
           <w:szCs w:val="28"/>
         </w:rPr>
       </w:pPr>
+    </w:p>
+    <w:p>
+      <w:pPr>
+        <w:pStyle w:val="ListParagraph"/>
+        <w:numPr>
+          <w:ilvl w:val="0"/>
+          <w:numId w:val="2"/>
+        </w:numPr>
+        <w:spacing w:after="0" w:line="480" w:lineRule="auto"/>
+        <w:ind w:left="426" w:hanging="426"/>
+        <w:rPr>
+          <w:rFonts w:ascii="Times New Roman" w:hAnsi="Times New Roman"/>
+          <w:b/>
+          <w:bCs/>
+          <w:sz w:val="24"/>
+          <w:szCs w:val="24"/>
+        </w:rPr>
+      </w:pPr>
+      <w:r>
+        <w:rPr>
+          <w:rFonts w:ascii="Times New Roman" w:hAnsi="Times New Roman"/>
+          <w:b/>
+          <w:bCs/>
+          <w:sz w:val="24"/>
+          <w:szCs w:val="24"/>
+        </w:rPr>
+        <w:t>Mindmap Diferensiasi Misi Perguruan Tinggi ke Penjaminan Mutu</w:t>
+      </w:r>
+    </w:p>
+    <w:p>
+      <w:pPr>
+        <w:pStyle w:val="ListParagraph"/>
+        <w:spacing w:after="0" w:line="480" w:lineRule="auto"/>
+        <w:ind w:left="426"/>
+        <w:jc w:val="both"/>
+        <w:rPr>
+          <w:rFonts w:ascii="Times New Roman" w:hAnsi="Times New Roman"/>
+          <w:b/>
+          <w:bCs/>
+          <w:sz w:val="28"/>
+          <w:szCs w:val="28"/>
+        </w:rPr>
+      </w:pPr>
+      <w:r>
+        <w:rPr>
+          <w:rFonts w:ascii="Times New Roman" w:hAnsi="Times New Roman"/>
+          <w:sz w:val="24"/>
+          <w:szCs w:val="24"/>
+        </w:rPr>
+        <w:t>${mindmap_diferensiasi}</w:t>
+      </w:r>
       <w:r>
         <w:rPr>
           <w:rFonts w:ascii="Times New Roman" w:hAnsi="Times New Roman"/>
@@ -2389,7 +2440,7 @@
           <w:sz w:val="24"/>
           <w:szCs w:val="24"/>
         </w:rPr>
-        <w:t xml:space="preserve"> ${tgl_update }</w:t>
+        <w:t xml:space="preserve"> ${tgl_update}</w:t>
       </w:r>
       <w:r>
         <w:rPr>

</xml_diff>